<commit_message>
Amplia referências verificadas de Farmácia
</commit_message>
<xml_diff>
--- a/templates/farmacia/modelo_relatorio_farmacia_automatizado.docx
+++ b/templates/farmacia/modelo_relatorio_farmacia_automatizado.docx
@@ -4806,8 +4806,8 @@
     </w:p>
     <w:p>
       <w:pPr>
-        <w:ind w:left="720"/>
-        <w:jc w:val="both"/>
+        <w:ind w:left="0" w:firstLine="0"/>
+        <w:jc w:val="left"/>
         <w:rPr>
           <w:rFonts w:ascii="Times New Roman" w:eastAsia="Arial" w:hAnsi="Times New Roman" w:cs="Times New Roman"/>
           <w:b/>

</xml_diff>

<commit_message>
Correção nos templates, mantendo o layout padrão exigido pela universidade
</commit_message>
<xml_diff>
--- a/templates/farmacia/modelo_relatorio_farmacia_automatizado.docx
+++ b/templates/farmacia/modelo_relatorio_farmacia_automatizado.docx
@@ -343,15 +343,7 @@
           <w:sz w:val="24"/>
           <w:szCs w:val="24"/>
         </w:rPr>
-        <w:t xml:space="preserve"> </w:t>
-      </w:r>
-      <w:r>
-        <w:rPr>
-          <w:rFonts w:ascii="Times New Roman" w:eastAsia="Arial" w:hAnsi="Times New Roman" w:cs="Times New Roman"/>
-          <w:sz w:val="24"/>
-          <w:szCs w:val="24"/>
-        </w:rPr>
-        <w:t>{{NOME_ALUNO}}</w:t>
+        <w:t xml:space="preserve"> {{NOME_ALUNO}}</w:t>
       </w:r>
     </w:p>
     <w:p>
@@ -412,23 +404,7 @@
           <w:sz w:val="24"/>
           <w:szCs w:val="24"/>
         </w:rPr>
-        <w:t>{{MODULO</w:t>
-      </w:r>
-      <w:r>
-        <w:rPr>
-          <w:rFonts w:ascii="Times New Roman" w:eastAsia="Arial" w:hAnsi="Times New Roman" w:cs="Times New Roman"/>
-          <w:sz w:val="24"/>
-          <w:szCs w:val="24"/>
-        </w:rPr>
-        <w:t>_ESTAGIO</w:t>
-      </w:r>
-      <w:r>
-        <w:rPr>
-          <w:rFonts w:ascii="Times New Roman" w:eastAsia="Arial" w:hAnsi="Times New Roman" w:cs="Times New Roman"/>
-          <w:sz w:val="24"/>
-          <w:szCs w:val="24"/>
-        </w:rPr>
-        <w:t>}}</w:t>
+        <w:t>{{MODULO_ESTAGIO}}</w:t>
       </w:r>
     </w:p>
     <w:p>
@@ -703,50 +679,56 @@
           <w:sz w:val="24"/>
           <w:szCs w:val="24"/>
         </w:rPr>
-        <w:t>ÁREA DO ESTÁGIO:</w:t>
-      </w:r>
-      <w:r>
-        <w:rPr>
-          <w:rFonts w:ascii="Times New Roman" w:eastAsia="Arial" w:hAnsi="Times New Roman" w:cs="Times New Roman"/>
-          <w:b/>
-          <w:bCs/>
-          <w:sz w:val="24"/>
-          <w:szCs w:val="24"/>
+        <w:t xml:space="preserve">ÁREA DO ESTÁGIO: </w:t>
+      </w:r>
+      <w:r>
+        <w:rPr>
+          <w:rFonts w:ascii="Times New Roman" w:eastAsia="Arial" w:hAnsi="Times New Roman" w:cs="Times New Roman"/>
+          <w:sz w:val="24"/>
+          <w:szCs w:val="24"/>
+        </w:rPr>
+        <w:t>{{AREA_ESTAGIO}}</w:t>
+      </w:r>
+    </w:p>
+    <w:p>
+      <w:pPr>
+        <w:spacing w:before="240" w:after="120" w:line="480" w:lineRule="auto"/>
+        <w:rPr>
+          <w:rFonts w:ascii="Times New Roman" w:eastAsia="Arial" w:hAnsi="Times New Roman" w:cs="Times New Roman"/>
+          <w:sz w:val="24"/>
+          <w:szCs w:val="24"/>
+          <w:highlight w:val="yellow"/>
+        </w:rPr>
+      </w:pPr>
+      <w:r>
+        <w:rPr>
+          <w:rFonts w:ascii="Times New Roman" w:eastAsia="Arial" w:hAnsi="Times New Roman" w:cs="Times New Roman"/>
+          <w:b/>
+          <w:bCs/>
+          <w:sz w:val="24"/>
+          <w:szCs w:val="24"/>
+          <w:highlight w:val="white"/>
+        </w:rPr>
+        <w:t xml:space="preserve">NOME DA INSTITUIÇÃO CEDENTE: </w:t>
+      </w:r>
+      <w:r>
+        <w:rPr>
+          <w:rFonts w:ascii="Times New Roman" w:eastAsia="Arial" w:hAnsi="Times New Roman" w:cs="Times New Roman"/>
+          <w:sz w:val="24"/>
+          <w:szCs w:val="24"/>
+          <w:highlight w:val="white"/>
+        </w:rPr>
+        <w:t>{{EMPRESA}}</w:t>
+      </w:r>
+      <w:r>
+        <w:rPr>
+          <w:rFonts w:ascii="Times New Roman" w:eastAsia="Arial" w:hAnsi="Times New Roman" w:cs="Times New Roman"/>
+          <w:sz w:val="24"/>
+          <w:szCs w:val="24"/>
+          <w:highlight w:val="yellow"/>
         </w:rPr>
         <w:t xml:space="preserve"> </w:t>
       </w:r>
-      <w:r>
-        <w:rPr>
-          <w:rFonts w:ascii="Times New Roman" w:eastAsia="Arial" w:hAnsi="Times New Roman" w:cs="Times New Roman"/>
-          <w:sz w:val="24"/>
-          <w:szCs w:val="24"/>
-        </w:rPr>
-        <w:t>{{</w:t>
-      </w:r>
-      <w:r>
-        <w:rPr>
-          <w:rFonts w:ascii="Times New Roman" w:eastAsia="Arial" w:hAnsi="Times New Roman" w:cs="Times New Roman"/>
-          <w:sz w:val="24"/>
-          <w:szCs w:val="24"/>
-        </w:rPr>
-        <w:t>AREA</w:t>
-      </w:r>
-      <w:r>
-        <w:rPr>
-          <w:rFonts w:ascii="Times New Roman" w:eastAsia="Arial" w:hAnsi="Times New Roman" w:cs="Times New Roman"/>
-          <w:sz w:val="24"/>
-          <w:szCs w:val="24"/>
-        </w:rPr>
-        <w:t>_ESTAGIO</w:t>
-      </w:r>
-      <w:r>
-        <w:rPr>
-          <w:rFonts w:ascii="Times New Roman" w:eastAsia="Arial" w:hAnsi="Times New Roman" w:cs="Times New Roman"/>
-          <w:sz w:val="24"/>
-          <w:szCs w:val="24"/>
-        </w:rPr>
-        <w:t>}}</w:t>
-      </w:r>
     </w:p>
     <w:p>
       <w:pPr>
@@ -755,6 +737,293 @@
           <w:rFonts w:ascii="Times New Roman" w:eastAsia="Arial" w:hAnsi="Times New Roman" w:cs="Times New Roman"/>
           <w:sz w:val="24"/>
           <w:szCs w:val="24"/>
+        </w:rPr>
+      </w:pPr>
+      <w:r>
+        <w:rPr>
+          <w:rFonts w:ascii="Times New Roman" w:eastAsia="Arial" w:hAnsi="Times New Roman" w:cs="Times New Roman"/>
+          <w:b/>
+          <w:bCs/>
+          <w:sz w:val="24"/>
+          <w:szCs w:val="24"/>
+        </w:rPr>
+        <w:t xml:space="preserve">PERÍODO DE REALIZAÇÃO : </w:t>
+      </w:r>
+      <w:r>
+        <w:rPr>
+          <w:rFonts w:ascii="Times New Roman" w:eastAsia="Arial" w:hAnsi="Times New Roman" w:cs="Times New Roman"/>
+          <w:sz w:val="24"/>
+          <w:szCs w:val="24"/>
+        </w:rPr>
+        <w:t>{{DATA_INICIO_ESTAGIO}} à {{DATA_FIM_ESTAGIO}}</w:t>
+      </w:r>
+    </w:p>
+    <w:p>
+      <w:pPr>
+        <w:spacing w:before="240" w:after="120" w:line="480" w:lineRule="auto"/>
+        <w:rPr>
+          <w:rFonts w:ascii="Times New Roman" w:eastAsia="Arial" w:hAnsi="Times New Roman" w:cs="Times New Roman"/>
+          <w:b/>
+          <w:bCs/>
+          <w:sz w:val="24"/>
+          <w:szCs w:val="24"/>
+          <w:highlight w:val="white"/>
+        </w:rPr>
+      </w:pPr>
+      <w:r>
+        <w:rPr>
+          <w:rFonts w:ascii="Times New Roman" w:eastAsia="Arial" w:hAnsi="Times New Roman" w:cs="Times New Roman"/>
+          <w:b/>
+          <w:bCs/>
+          <w:sz w:val="24"/>
+          <w:szCs w:val="24"/>
+        </w:rPr>
+        <w:t>MÓDULO: (   )</w:t>
+      </w:r>
+      <w:r>
+        <w:rPr>
+          <w:rFonts w:ascii="Times New Roman" w:eastAsia="Arial" w:hAnsi="Times New Roman" w:cs="Times New Roman"/>
+          <w:b/>
+          <w:bCs/>
+          <w:sz w:val="24"/>
+          <w:szCs w:val="24"/>
+          <w:highlight w:val="white"/>
+        </w:rPr>
+        <w:t xml:space="preserve"> I;</w:t>
+      </w:r>
+      <w:r>
+        <w:rPr>
+          <w:rFonts w:ascii="Times New Roman" w:eastAsia="Arial" w:hAnsi="Times New Roman" w:cs="Times New Roman"/>
+          <w:b/>
+          <w:bCs/>
+          <w:sz w:val="24"/>
+          <w:szCs w:val="24"/>
+          <w:highlight w:val="white"/>
+        </w:rPr>
+        <w:tab/>
+        <w:t xml:space="preserve">   </w:t>
+      </w:r>
+      <w:r>
+        <w:rPr>
+          <w:rFonts w:ascii="Times New Roman" w:eastAsia="Arial" w:hAnsi="Times New Roman" w:cs="Times New Roman"/>
+          <w:b/>
+          <w:bCs/>
+          <w:sz w:val="24"/>
+          <w:szCs w:val="24"/>
+        </w:rPr>
+        <w:t>(   )</w:t>
+      </w:r>
+      <w:r>
+        <w:rPr>
+          <w:rFonts w:ascii="Times New Roman" w:eastAsia="Arial" w:hAnsi="Times New Roman" w:cs="Times New Roman"/>
+          <w:b/>
+          <w:bCs/>
+          <w:sz w:val="24"/>
+          <w:szCs w:val="24"/>
+          <w:highlight w:val="white"/>
+        </w:rPr>
+        <w:t xml:space="preserve"> II; </w:t>
+      </w:r>
+      <w:r>
+        <w:rPr>
+          <w:rFonts w:ascii="Times New Roman" w:eastAsia="Arial" w:hAnsi="Times New Roman" w:cs="Times New Roman"/>
+          <w:b/>
+          <w:bCs/>
+          <w:sz w:val="24"/>
+          <w:szCs w:val="24"/>
+          <w:highlight w:val="white"/>
+        </w:rPr>
+        <w:tab/>
+      </w:r>
+      <w:r>
+        <w:rPr>
+          <w:rFonts w:ascii="Times New Roman" w:eastAsia="Arial" w:hAnsi="Times New Roman" w:cs="Times New Roman"/>
+          <w:b/>
+          <w:bCs/>
+          <w:sz w:val="24"/>
+          <w:szCs w:val="24"/>
+        </w:rPr>
+        <w:t>(   )</w:t>
+      </w:r>
+      <w:r>
+        <w:rPr>
+          <w:rFonts w:ascii="Times New Roman" w:eastAsia="Arial" w:hAnsi="Times New Roman" w:cs="Times New Roman"/>
+          <w:b/>
+          <w:bCs/>
+          <w:sz w:val="24"/>
+          <w:szCs w:val="24"/>
+          <w:highlight w:val="white"/>
+        </w:rPr>
+        <w:t xml:space="preserve"> III;</w:t>
+      </w:r>
+      <w:r>
+        <w:rPr>
+          <w:rFonts w:ascii="Times New Roman" w:eastAsia="Arial" w:hAnsi="Times New Roman" w:cs="Times New Roman"/>
+          <w:b/>
+          <w:bCs/>
+          <w:sz w:val="24"/>
+          <w:szCs w:val="24"/>
+          <w:highlight w:val="white"/>
+        </w:rPr>
+        <w:tab/>
+      </w:r>
+      <w:r>
+        <w:rPr>
+          <w:rFonts w:ascii="Times New Roman" w:eastAsia="Arial" w:hAnsi="Times New Roman" w:cs="Times New Roman"/>
+          <w:b/>
+          <w:bCs/>
+          <w:sz w:val="24"/>
+          <w:szCs w:val="24"/>
+        </w:rPr>
+        <w:t>(   )</w:t>
+      </w:r>
+      <w:r>
+        <w:rPr>
+          <w:rFonts w:ascii="Times New Roman" w:eastAsia="Arial" w:hAnsi="Times New Roman" w:cs="Times New Roman"/>
+          <w:b/>
+          <w:bCs/>
+          <w:sz w:val="24"/>
+          <w:szCs w:val="24"/>
+          <w:highlight w:val="white"/>
+        </w:rPr>
+        <w:t xml:space="preserve"> IV; </w:t>
+      </w:r>
+      <w:r>
+        <w:rPr>
+          <w:rFonts w:ascii="Times New Roman" w:eastAsia="Arial" w:hAnsi="Times New Roman" w:cs="Times New Roman"/>
+          <w:b/>
+          <w:bCs/>
+          <w:sz w:val="24"/>
+          <w:szCs w:val="24"/>
+          <w:highlight w:val="white"/>
+        </w:rPr>
+        <w:tab/>
+      </w:r>
+      <w:r>
+        <w:rPr>
+          <w:rFonts w:ascii="Times New Roman" w:eastAsia="Arial" w:hAnsi="Times New Roman" w:cs="Times New Roman"/>
+          <w:b/>
+          <w:bCs/>
+          <w:sz w:val="24"/>
+          <w:szCs w:val="24"/>
+        </w:rPr>
+        <w:t>(   )</w:t>
+      </w:r>
+      <w:r>
+        <w:rPr>
+          <w:rFonts w:ascii="Times New Roman" w:eastAsia="Arial" w:hAnsi="Times New Roman" w:cs="Times New Roman"/>
+          <w:b/>
+          <w:bCs/>
+          <w:sz w:val="24"/>
+          <w:szCs w:val="24"/>
+          <w:highlight w:val="white"/>
+        </w:rPr>
+        <w:t xml:space="preserve"> V;</w:t>
+      </w:r>
+      <w:r>
+        <w:rPr>
+          <w:rFonts w:ascii="Times New Roman" w:eastAsia="Arial" w:hAnsi="Times New Roman" w:cs="Times New Roman"/>
+          <w:b/>
+          <w:bCs/>
+          <w:sz w:val="24"/>
+          <w:szCs w:val="24"/>
+          <w:highlight w:val="white"/>
+        </w:rPr>
+        <w:tab/>
+      </w:r>
+      <w:r>
+        <w:rPr>
+          <w:rFonts w:ascii="Times New Roman" w:eastAsia="Arial" w:hAnsi="Times New Roman" w:cs="Times New Roman"/>
+          <w:b/>
+          <w:bCs/>
+          <w:sz w:val="24"/>
+          <w:szCs w:val="24"/>
+          <w:highlight w:val="white"/>
+        </w:rPr>
+        <w:tab/>
+      </w:r>
+      <w:r>
+        <w:rPr>
+          <w:rFonts w:ascii="Times New Roman" w:eastAsia="Arial" w:hAnsi="Times New Roman" w:cs="Times New Roman"/>
+          <w:b/>
+          <w:bCs/>
+          <w:sz w:val="24"/>
+          <w:szCs w:val="24"/>
+        </w:rPr>
+        <w:t xml:space="preserve">(  ) </w:t>
+      </w:r>
+      <w:r>
+        <w:rPr>
+          <w:rFonts w:ascii="Times New Roman" w:eastAsia="Arial" w:hAnsi="Times New Roman" w:cs="Times New Roman"/>
+          <w:b/>
+          <w:bCs/>
+          <w:sz w:val="24"/>
+          <w:szCs w:val="24"/>
+          <w:highlight w:val="white"/>
+        </w:rPr>
+        <w:t>VI</w:t>
+      </w:r>
+    </w:p>
+    <w:p>
+      <w:pPr>
+        <w:spacing w:before="240" w:after="120" w:line="480" w:lineRule="auto"/>
+        <w:rPr>
+          <w:rFonts w:ascii="Times New Roman" w:eastAsia="Arial" w:hAnsi="Times New Roman" w:cs="Times New Roman"/>
+          <w:sz w:val="24"/>
+          <w:szCs w:val="24"/>
+          <w:highlight w:val="white"/>
+        </w:rPr>
+      </w:pPr>
+      <w:r>
+        <w:rPr>
+          <w:rFonts w:ascii="Times New Roman" w:eastAsia="Arial" w:hAnsi="Times New Roman" w:cs="Times New Roman"/>
+          <w:b/>
+          <w:bCs/>
+          <w:sz w:val="24"/>
+          <w:szCs w:val="24"/>
+        </w:rPr>
+        <w:t xml:space="preserve">DEPENDÊNCIA: (   ) </w:t>
+      </w:r>
+      <w:r>
+        <w:rPr>
+          <w:rFonts w:ascii="Times New Roman" w:eastAsia="Arial" w:hAnsi="Times New Roman" w:cs="Times New Roman"/>
+          <w:b/>
+          <w:bCs/>
+          <w:sz w:val="24"/>
+          <w:szCs w:val="24"/>
+          <w:highlight w:val="white"/>
+        </w:rPr>
+        <w:t xml:space="preserve">SIM   </w:t>
+      </w:r>
+      <w:r>
+        <w:rPr>
+          <w:rFonts w:ascii="Times New Roman" w:eastAsia="Arial" w:hAnsi="Times New Roman" w:cs="Times New Roman"/>
+          <w:b/>
+          <w:bCs/>
+          <w:sz w:val="24"/>
+          <w:szCs w:val="24"/>
+        </w:rPr>
+        <w:t>(   )</w:t>
+      </w:r>
+      <w:r>
+        <w:rPr>
+          <w:rFonts w:ascii="Times New Roman" w:eastAsia="Arial" w:hAnsi="Times New Roman" w:cs="Times New Roman"/>
+          <w:b/>
+          <w:bCs/>
+          <w:sz w:val="24"/>
+          <w:szCs w:val="24"/>
+          <w:highlight w:val="white"/>
+        </w:rPr>
+        <w:t xml:space="preserve"> NÃO</w:t>
+      </w:r>
+    </w:p>
+    <w:p>
+      <w:pPr>
+        <w:spacing w:before="240" w:after="120" w:line="480" w:lineRule="auto"/>
+        <w:rPr>
+          <w:rFonts w:ascii="Times New Roman" w:eastAsia="Arial" w:hAnsi="Times New Roman" w:cs="Times New Roman"/>
+          <w:sz w:val="24"/>
+          <w:szCs w:val="24"/>
           <w:highlight w:val="yellow"/>
         </w:rPr>
       </w:pPr>
@@ -765,398 +1034,8 @@
           <w:bCs/>
           <w:sz w:val="24"/>
           <w:szCs w:val="24"/>
-          <w:highlight w:val="white"/>
-        </w:rPr>
-        <w:t>NOME DA INSTITUIÇÃO CEDENTE:</w:t>
-      </w:r>
-      <w:r>
-        <w:rPr>
-          <w:rFonts w:ascii="Times New Roman" w:eastAsia="Arial" w:hAnsi="Times New Roman" w:cs="Times New Roman"/>
-          <w:b/>
-          <w:bCs/>
-          <w:sz w:val="24"/>
-          <w:szCs w:val="24"/>
-          <w:highlight w:val="white"/>
-        </w:rPr>
-        <w:t xml:space="preserve"> </w:t>
-      </w:r>
-      <w:r>
-        <w:rPr>
-          <w:rFonts w:ascii="Times New Roman" w:eastAsia="Arial" w:hAnsi="Times New Roman" w:cs="Times New Roman"/>
-          <w:sz w:val="24"/>
-          <w:szCs w:val="24"/>
-          <w:highlight w:val="white"/>
-        </w:rPr>
-        <w:t>{{EMPRESA}}</w:t>
-      </w:r>
-      <w:r>
-        <w:rPr>
-          <w:rFonts w:ascii="Times New Roman" w:eastAsia="Arial" w:hAnsi="Times New Roman" w:cs="Times New Roman"/>
-          <w:sz w:val="24"/>
-          <w:szCs w:val="24"/>
-          <w:highlight w:val="yellow"/>
-        </w:rPr>
-        <w:t xml:space="preserve"> </w:t>
-      </w:r>
-    </w:p>
-    <w:p>
-      <w:pPr>
-        <w:spacing w:before="240" w:after="120" w:line="480" w:lineRule="auto"/>
-        <w:rPr>
-          <w:rFonts w:ascii="Times New Roman" w:eastAsia="Arial" w:hAnsi="Times New Roman" w:cs="Times New Roman"/>
-          <w:sz w:val="24"/>
-          <w:szCs w:val="24"/>
-        </w:rPr>
-      </w:pPr>
-      <w:r>
-        <w:rPr>
-          <w:rFonts w:ascii="Times New Roman" w:eastAsia="Arial" w:hAnsi="Times New Roman" w:cs="Times New Roman"/>
-          <w:b/>
-          <w:bCs/>
-          <w:sz w:val="24"/>
-          <w:szCs w:val="24"/>
-        </w:rPr>
-        <w:t xml:space="preserve">PERÍODO DE REALIZAÇÃO : </w:t>
-      </w:r>
-      <w:r>
-        <w:rPr>
-          <w:rFonts w:ascii="Times New Roman" w:eastAsia="Arial" w:hAnsi="Times New Roman" w:cs="Times New Roman"/>
-          <w:sz w:val="24"/>
-          <w:szCs w:val="24"/>
-        </w:rPr>
-        <w:t>{{DATA_INICIO</w:t>
-      </w:r>
-      <w:r>
-        <w:rPr>
-          <w:rFonts w:ascii="Times New Roman" w:eastAsia="Arial" w:hAnsi="Times New Roman" w:cs="Times New Roman"/>
-          <w:sz w:val="24"/>
-          <w:szCs w:val="24"/>
-        </w:rPr>
-        <w:t>_ESTAGIO</w:t>
-      </w:r>
-      <w:r>
-        <w:rPr>
-          <w:rFonts w:ascii="Times New Roman" w:eastAsia="Arial" w:hAnsi="Times New Roman" w:cs="Times New Roman"/>
-          <w:sz w:val="24"/>
-          <w:szCs w:val="24"/>
-        </w:rPr>
-        <w:t>}} à {{DATA_FIM</w:t>
-      </w:r>
-      <w:r>
-        <w:rPr>
-          <w:rFonts w:ascii="Times New Roman" w:eastAsia="Arial" w:hAnsi="Times New Roman" w:cs="Times New Roman"/>
-          <w:sz w:val="24"/>
-          <w:szCs w:val="24"/>
-        </w:rPr>
-        <w:t>_ESTAGIO</w:t>
-      </w:r>
-      <w:r>
-        <w:rPr>
-          <w:rFonts w:ascii="Times New Roman" w:eastAsia="Arial" w:hAnsi="Times New Roman" w:cs="Times New Roman"/>
-          <w:sz w:val="24"/>
-          <w:szCs w:val="24"/>
-        </w:rPr>
-        <w:t>}}</w:t>
-      </w:r>
-    </w:p>
-    <w:p>
-      <w:pPr>
-        <w:spacing w:before="240" w:after="120" w:line="480" w:lineRule="auto"/>
-        <w:rPr>
-          <w:rFonts w:ascii="Times New Roman" w:eastAsia="Arial" w:hAnsi="Times New Roman" w:cs="Times New Roman"/>
-          <w:b/>
-          <w:bCs/>
-          <w:sz w:val="24"/>
-          <w:szCs w:val="24"/>
-          <w:highlight w:val="white"/>
-        </w:rPr>
-      </w:pPr>
-      <w:r>
-        <w:rPr>
-          <w:rFonts w:ascii="Times New Roman" w:eastAsia="Arial" w:hAnsi="Times New Roman" w:cs="Times New Roman"/>
-          <w:b/>
-          <w:bCs/>
-          <w:sz w:val="24"/>
-          <w:szCs w:val="24"/>
-        </w:rPr>
-        <w:t>MÓDULO: (   )</w:t>
-      </w:r>
-      <w:r>
-        <w:rPr>
-          <w:rFonts w:ascii="Times New Roman" w:eastAsia="Arial" w:hAnsi="Times New Roman" w:cs="Times New Roman"/>
-          <w:b/>
-          <w:bCs/>
-          <w:sz w:val="24"/>
-          <w:szCs w:val="24"/>
-          <w:highlight w:val="white"/>
-        </w:rPr>
-        <w:t xml:space="preserve"> I;</w:t>
-      </w:r>
-      <w:r>
-        <w:rPr>
-          <w:rFonts w:ascii="Times New Roman" w:eastAsia="Arial" w:hAnsi="Times New Roman" w:cs="Times New Roman"/>
-          <w:b/>
-          <w:bCs/>
-          <w:sz w:val="24"/>
-          <w:szCs w:val="24"/>
-          <w:highlight w:val="white"/>
-        </w:rPr>
-        <w:tab/>
-      </w:r>
-      <w:r>
-        <w:rPr>
-          <w:rFonts w:ascii="Times New Roman" w:eastAsia="Arial" w:hAnsi="Times New Roman" w:cs="Times New Roman"/>
-          <w:b/>
-          <w:bCs/>
-          <w:sz w:val="24"/>
-          <w:szCs w:val="24"/>
-          <w:highlight w:val="white"/>
-        </w:rPr>
-        <w:t xml:space="preserve">   </w:t>
-      </w:r>
-      <w:r>
-        <w:rPr>
-          <w:rFonts w:ascii="Times New Roman" w:eastAsia="Arial" w:hAnsi="Times New Roman" w:cs="Times New Roman"/>
-          <w:b/>
-          <w:bCs/>
-          <w:sz w:val="24"/>
-          <w:szCs w:val="24"/>
-        </w:rPr>
-        <w:t>(   )</w:t>
-      </w:r>
-      <w:r>
-        <w:rPr>
-          <w:rFonts w:ascii="Times New Roman" w:eastAsia="Arial" w:hAnsi="Times New Roman" w:cs="Times New Roman"/>
-          <w:b/>
-          <w:bCs/>
-          <w:sz w:val="24"/>
-          <w:szCs w:val="24"/>
-          <w:highlight w:val="white"/>
-        </w:rPr>
-        <w:t xml:space="preserve"> II; </w:t>
-      </w:r>
-      <w:r>
-        <w:rPr>
-          <w:rFonts w:ascii="Times New Roman" w:eastAsia="Arial" w:hAnsi="Times New Roman" w:cs="Times New Roman"/>
-          <w:b/>
-          <w:bCs/>
-          <w:sz w:val="24"/>
-          <w:szCs w:val="24"/>
-          <w:highlight w:val="white"/>
-        </w:rPr>
-        <w:tab/>
-      </w:r>
-      <w:r>
-        <w:rPr>
-          <w:rFonts w:ascii="Times New Roman" w:eastAsia="Arial" w:hAnsi="Times New Roman" w:cs="Times New Roman"/>
-          <w:b/>
-          <w:bCs/>
-          <w:sz w:val="24"/>
-          <w:szCs w:val="24"/>
-        </w:rPr>
-        <w:t>(   )</w:t>
-      </w:r>
-      <w:r>
-        <w:rPr>
-          <w:rFonts w:ascii="Times New Roman" w:eastAsia="Arial" w:hAnsi="Times New Roman" w:cs="Times New Roman"/>
-          <w:b/>
-          <w:bCs/>
-          <w:sz w:val="24"/>
-          <w:szCs w:val="24"/>
-          <w:highlight w:val="white"/>
-        </w:rPr>
-        <w:t xml:space="preserve"> III;</w:t>
-      </w:r>
-      <w:r>
-        <w:rPr>
-          <w:rFonts w:ascii="Times New Roman" w:eastAsia="Arial" w:hAnsi="Times New Roman" w:cs="Times New Roman"/>
-          <w:b/>
-          <w:bCs/>
-          <w:sz w:val="24"/>
-          <w:szCs w:val="24"/>
-          <w:highlight w:val="white"/>
-        </w:rPr>
-        <w:tab/>
-      </w:r>
-      <w:r>
-        <w:rPr>
-          <w:rFonts w:ascii="Times New Roman" w:eastAsia="Arial" w:hAnsi="Times New Roman" w:cs="Times New Roman"/>
-          <w:b/>
-          <w:bCs/>
-          <w:sz w:val="24"/>
-          <w:szCs w:val="24"/>
-        </w:rPr>
-        <w:t>(   )</w:t>
-      </w:r>
-      <w:r>
-        <w:rPr>
-          <w:rFonts w:ascii="Times New Roman" w:eastAsia="Arial" w:hAnsi="Times New Roman" w:cs="Times New Roman"/>
-          <w:b/>
-          <w:bCs/>
-          <w:sz w:val="24"/>
-          <w:szCs w:val="24"/>
-          <w:highlight w:val="white"/>
-        </w:rPr>
-        <w:t xml:space="preserve"> IV; </w:t>
-      </w:r>
-      <w:r>
-        <w:rPr>
-          <w:rFonts w:ascii="Times New Roman" w:eastAsia="Arial" w:hAnsi="Times New Roman" w:cs="Times New Roman"/>
-          <w:b/>
-          <w:bCs/>
-          <w:sz w:val="24"/>
-          <w:szCs w:val="24"/>
-          <w:highlight w:val="white"/>
-        </w:rPr>
-        <w:tab/>
-      </w:r>
-      <w:r>
-        <w:rPr>
-          <w:rFonts w:ascii="Times New Roman" w:eastAsia="Arial" w:hAnsi="Times New Roman" w:cs="Times New Roman"/>
-          <w:b/>
-          <w:bCs/>
-          <w:sz w:val="24"/>
-          <w:szCs w:val="24"/>
-        </w:rPr>
-        <w:t>(   )</w:t>
-      </w:r>
-      <w:r>
-        <w:rPr>
-          <w:rFonts w:ascii="Times New Roman" w:eastAsia="Arial" w:hAnsi="Times New Roman" w:cs="Times New Roman"/>
-          <w:b/>
-          <w:bCs/>
-          <w:sz w:val="24"/>
-          <w:szCs w:val="24"/>
-          <w:highlight w:val="white"/>
-        </w:rPr>
-        <w:t xml:space="preserve"> V;</w:t>
-      </w:r>
-      <w:r>
-        <w:rPr>
-          <w:rFonts w:ascii="Times New Roman" w:eastAsia="Arial" w:hAnsi="Times New Roman" w:cs="Times New Roman"/>
-          <w:b/>
-          <w:bCs/>
-          <w:sz w:val="24"/>
-          <w:szCs w:val="24"/>
-          <w:highlight w:val="white"/>
-        </w:rPr>
-        <w:tab/>
-      </w:r>
-      <w:r>
-        <w:rPr>
-          <w:rFonts w:ascii="Times New Roman" w:eastAsia="Arial" w:hAnsi="Times New Roman" w:cs="Times New Roman"/>
-          <w:b/>
-          <w:bCs/>
-          <w:sz w:val="24"/>
-          <w:szCs w:val="24"/>
-          <w:highlight w:val="white"/>
-        </w:rPr>
-        <w:tab/>
-      </w:r>
-      <w:r>
-        <w:rPr>
-          <w:rFonts w:ascii="Times New Roman" w:eastAsia="Arial" w:hAnsi="Times New Roman" w:cs="Times New Roman"/>
-          <w:b/>
-          <w:bCs/>
-          <w:sz w:val="24"/>
-          <w:szCs w:val="24"/>
-        </w:rPr>
-        <w:t xml:space="preserve">(  ) </w:t>
-      </w:r>
-      <w:r>
-        <w:rPr>
-          <w:rFonts w:ascii="Times New Roman" w:eastAsia="Arial" w:hAnsi="Times New Roman" w:cs="Times New Roman"/>
-          <w:b/>
-          <w:bCs/>
-          <w:sz w:val="24"/>
-          <w:szCs w:val="24"/>
-          <w:highlight w:val="white"/>
-        </w:rPr>
-        <w:t>VI</w:t>
-      </w:r>
-    </w:p>
-    <w:p>
-      <w:pPr>
-        <w:spacing w:before="240" w:after="120" w:line="480" w:lineRule="auto"/>
-        <w:rPr>
-          <w:rFonts w:ascii="Times New Roman" w:eastAsia="Arial" w:hAnsi="Times New Roman" w:cs="Times New Roman"/>
-          <w:sz w:val="24"/>
-          <w:szCs w:val="24"/>
-          <w:highlight w:val="white"/>
-        </w:rPr>
-      </w:pPr>
-      <w:r>
-        <w:rPr>
-          <w:rFonts w:ascii="Times New Roman" w:eastAsia="Arial" w:hAnsi="Times New Roman" w:cs="Times New Roman"/>
-          <w:b/>
-          <w:bCs/>
-          <w:sz w:val="24"/>
-          <w:szCs w:val="24"/>
-        </w:rPr>
-        <w:t xml:space="preserve">DEPENDÊNCIA: (   ) </w:t>
-      </w:r>
-      <w:r>
-        <w:rPr>
-          <w:rFonts w:ascii="Times New Roman" w:eastAsia="Arial" w:hAnsi="Times New Roman" w:cs="Times New Roman"/>
-          <w:b/>
-          <w:bCs/>
-          <w:sz w:val="24"/>
-          <w:szCs w:val="24"/>
-          <w:highlight w:val="white"/>
-        </w:rPr>
-        <w:t xml:space="preserve">SIM   </w:t>
-      </w:r>
-      <w:r>
-        <w:rPr>
-          <w:rFonts w:ascii="Times New Roman" w:eastAsia="Arial" w:hAnsi="Times New Roman" w:cs="Times New Roman"/>
-          <w:b/>
-          <w:bCs/>
-          <w:sz w:val="24"/>
-          <w:szCs w:val="24"/>
-        </w:rPr>
-        <w:t>(   )</w:t>
-      </w:r>
-      <w:r>
-        <w:rPr>
-          <w:rFonts w:ascii="Times New Roman" w:eastAsia="Arial" w:hAnsi="Times New Roman" w:cs="Times New Roman"/>
-          <w:b/>
-          <w:bCs/>
-          <w:sz w:val="24"/>
-          <w:szCs w:val="24"/>
-          <w:highlight w:val="white"/>
-        </w:rPr>
-        <w:t xml:space="preserve"> NÃO</w:t>
-      </w:r>
-    </w:p>
-    <w:p>
-      <w:pPr>
-        <w:spacing w:before="240" w:after="120" w:line="480" w:lineRule="auto"/>
-        <w:rPr>
-          <w:rFonts w:ascii="Times New Roman" w:eastAsia="Arial" w:hAnsi="Times New Roman" w:cs="Times New Roman"/>
-          <w:sz w:val="24"/>
-          <w:szCs w:val="24"/>
-          <w:highlight w:val="yellow"/>
-        </w:rPr>
-      </w:pPr>
-      <w:r>
-        <w:rPr>
-          <w:rFonts w:ascii="Times New Roman" w:eastAsia="Arial" w:hAnsi="Times New Roman" w:cs="Times New Roman"/>
-          <w:b/>
-          <w:bCs/>
-          <w:sz w:val="24"/>
-          <w:szCs w:val="24"/>
-        </w:rPr>
-        <w:t>CARGA HORÁRIA:</w:t>
-      </w:r>
-      <w:r>
-        <w:rPr>
-          <w:rFonts w:ascii="Times New Roman" w:eastAsia="Arial" w:hAnsi="Times New Roman" w:cs="Times New Roman"/>
-          <w:b/>
-          <w:bCs/>
-          <w:sz w:val="24"/>
-          <w:szCs w:val="24"/>
-        </w:rPr>
-        <w:t xml:space="preserve"> </w:t>
+        </w:rPr>
+        <w:t xml:space="preserve">CARGA HORÁRIA: </w:t>
       </w:r>
       <w:r>
         <w:rPr>
@@ -1342,25 +1221,7 @@
           <w:szCs w:val="24"/>
           <w:highlight w:val="white"/>
         </w:rPr>
-        <w:t xml:space="preserve">São Paulo, </w:t>
-      </w:r>
-      <w:r>
-        <w:rPr>
-          <w:rFonts w:ascii="Times New Roman" w:eastAsia="Arial" w:hAnsi="Times New Roman" w:cs="Times New Roman"/>
-          <w:sz w:val="24"/>
-          <w:szCs w:val="24"/>
-          <w:highlight w:val="white"/>
-        </w:rPr>
-        <w:t>{{DATA_FIM_EXTENSO}}</w:t>
-      </w:r>
-      <w:r>
-        <w:rPr>
-          <w:rFonts w:ascii="Times New Roman" w:eastAsia="Arial" w:hAnsi="Times New Roman" w:cs="Times New Roman"/>
-          <w:sz w:val="24"/>
-          <w:szCs w:val="24"/>
-          <w:highlight w:val="white"/>
-        </w:rPr>
-        <w:t>.</w:t>
+        <w:t>São Paulo, {{DATA_FIM_EXTENSO}}.</w:t>
       </w:r>
     </w:p>
     <w:p>
@@ -1434,15 +1295,7 @@
           <w:sz w:val="24"/>
           <w:szCs w:val="24"/>
         </w:rPr>
-        <w:t xml:space="preserve"> </w:t>
-      </w:r>
-      <w:r>
-        <w:rPr>
-          <w:rFonts w:ascii="Times New Roman" w:eastAsia="Arial" w:hAnsi="Times New Roman" w:cs="Times New Roman"/>
-          <w:sz w:val="24"/>
-          <w:szCs w:val="24"/>
-        </w:rPr>
-        <w:t>{{NOME_ALUNO}}</w:t>
+        <w:t xml:space="preserve"> {{NOME_ALUNO}}</w:t>
       </w:r>
     </w:p>
     <w:p>
@@ -1504,7 +1357,7 @@
           <w:szCs w:val="24"/>
           <w:highlight w:val="white"/>
         </w:rPr>
-        <w:t xml:space="preserve"> </w:t>
+        <w:t xml:space="preserve"> {{BAIRRO_ALUNO}}</w:t>
       </w:r>
       <w:r>
         <w:rPr>
@@ -1513,7 +1366,7 @@
           <w:szCs w:val="24"/>
           <w:highlight w:val="white"/>
         </w:rPr>
-        <w:t>{{BAIRRO_ALUNO}}</w:t>
+        <w:tab/>
       </w:r>
       <w:r>
         <w:rPr>
@@ -1527,23 +1380,34 @@
       <w:r>
         <w:rPr>
           <w:rFonts w:ascii="Times New Roman" w:eastAsia="Arial" w:hAnsi="Times New Roman" w:cs="Times New Roman"/>
+          <w:b/>
+          <w:bCs/>
           <w:sz w:val="24"/>
           <w:szCs w:val="24"/>
           <w:highlight w:val="white"/>
         </w:rPr>
-        <w:tab/>
-      </w:r>
-      <w:r>
-        <w:rPr>
-          <w:rFonts w:ascii="Times New Roman" w:eastAsia="Arial" w:hAnsi="Times New Roman" w:cs="Times New Roman"/>
-          <w:b/>
-          <w:bCs/>
+        <w:t xml:space="preserve">CIDADE: </w:t>
+      </w:r>
+      <w:r>
+        <w:rPr>
+          <w:rFonts w:ascii="Times New Roman" w:eastAsia="Arial" w:hAnsi="Times New Roman" w:cs="Times New Roman"/>
           <w:sz w:val="24"/>
           <w:szCs w:val="24"/>
           <w:highlight w:val="white"/>
         </w:rPr>
-        <w:t>CIDADE:</w:t>
-      </w:r>
+        <w:t>{{CIDADE_ALUNO}}</w:t>
+      </w:r>
+    </w:p>
+    <w:p>
+      <w:pPr>
+        <w:spacing w:before="240" w:after="120" w:line="480" w:lineRule="auto"/>
+        <w:rPr>
+          <w:rFonts w:ascii="Times New Roman" w:eastAsia="Arial" w:hAnsi="Times New Roman" w:cs="Times New Roman"/>
+          <w:sz w:val="24"/>
+          <w:szCs w:val="24"/>
+          <w:highlight w:val="yellow"/>
+        </w:rPr>
+      </w:pPr>
       <w:r>
         <w:rPr>
           <w:rFonts w:ascii="Times New Roman" w:eastAsia="Arial" w:hAnsi="Times New Roman" w:cs="Times New Roman"/>
@@ -1553,7 +1417,7 @@
           <w:szCs w:val="24"/>
           <w:highlight w:val="white"/>
         </w:rPr>
-        <w:t xml:space="preserve"> </w:t>
+        <w:t xml:space="preserve">E-MAIL (@uni9): </w:t>
       </w:r>
       <w:r>
         <w:rPr>
@@ -1562,7 +1426,7 @@
           <w:szCs w:val="24"/>
           <w:highlight w:val="white"/>
         </w:rPr>
-        <w:t>{{CIDADE_ALUNO}}</w:t>
+        <w:t>{{EMAIL_ALUNO}}</w:t>
       </w:r>
     </w:p>
     <w:p>
@@ -1584,8 +1448,27 @@
           <w:szCs w:val="24"/>
           <w:highlight w:val="white"/>
         </w:rPr>
-        <w:t>E-MAIL (@uni9):</w:t>
-      </w:r>
+        <w:t>Nº DE TELEFONE CELULAR:</w:t>
+      </w:r>
+      <w:r>
+        <w:rPr>
+          <w:rFonts w:ascii="Times New Roman" w:eastAsia="Arial" w:hAnsi="Times New Roman" w:cs="Times New Roman"/>
+          <w:sz w:val="24"/>
+          <w:szCs w:val="24"/>
+        </w:rPr>
+        <w:t xml:space="preserve"> {{TELEFONE_ALUNO}}</w:t>
+      </w:r>
+    </w:p>
+    <w:p>
+      <w:pPr>
+        <w:spacing w:before="240" w:after="120" w:line="480" w:lineRule="auto"/>
+        <w:rPr>
+          <w:rFonts w:ascii="Times New Roman" w:eastAsia="Arial" w:hAnsi="Times New Roman" w:cs="Times New Roman"/>
+          <w:sz w:val="24"/>
+          <w:szCs w:val="24"/>
+          <w:highlight w:val="yellow"/>
+        </w:rPr>
+      </w:pPr>
       <w:r>
         <w:rPr>
           <w:rFonts w:ascii="Times New Roman" w:eastAsia="Arial" w:hAnsi="Times New Roman" w:cs="Times New Roman"/>
@@ -1595,131 +1478,7 @@
           <w:szCs w:val="24"/>
           <w:highlight w:val="white"/>
         </w:rPr>
-        <w:t xml:space="preserve"> </w:t>
-      </w:r>
-      <w:r>
-        <w:rPr>
-          <w:rFonts w:ascii="Times New Roman" w:eastAsia="Arial" w:hAnsi="Times New Roman" w:cs="Times New Roman"/>
-          <w:sz w:val="24"/>
-          <w:szCs w:val="24"/>
-          <w:highlight w:val="white"/>
-        </w:rPr>
-        <w:t>{{EMAIL_ALUNO}}</w:t>
-      </w:r>
-    </w:p>
-    <w:p>
-      <w:pPr>
-        <w:spacing w:before="240" w:after="120" w:line="480" w:lineRule="auto"/>
-        <w:rPr>
-          <w:rFonts w:ascii="Times New Roman" w:eastAsia="Arial" w:hAnsi="Times New Roman" w:cs="Times New Roman"/>
-          <w:sz w:val="24"/>
-          <w:szCs w:val="24"/>
-          <w:highlight w:val="yellow"/>
-        </w:rPr>
-      </w:pPr>
-      <w:r>
-        <w:rPr>
-          <w:rFonts w:ascii="Times New Roman" w:eastAsia="Arial" w:hAnsi="Times New Roman" w:cs="Times New Roman"/>
-          <w:b/>
-          <w:bCs/>
-          <w:sz w:val="24"/>
-          <w:szCs w:val="24"/>
-          <w:highlight w:val="white"/>
-        </w:rPr>
-        <w:t>Nº DE TELEFONE CELULAR:</w:t>
-      </w:r>
-      <w:r>
-        <w:rPr>
-          <w:rFonts w:ascii="Times New Roman" w:eastAsia="Arial" w:hAnsi="Times New Roman" w:cs="Times New Roman"/>
-          <w:sz w:val="24"/>
-          <w:szCs w:val="24"/>
-        </w:rPr>
-        <w:t xml:space="preserve"> </w:t>
-      </w:r>
-      <w:r>
-        <w:rPr>
-          <w:rFonts w:ascii="Times New Roman" w:eastAsia="Arial" w:hAnsi="Times New Roman" w:cs="Times New Roman"/>
-          <w:sz w:val="24"/>
-          <w:szCs w:val="24"/>
-        </w:rPr>
-        <w:t>{{TELEFONE_ALUNO}}</w:t>
-      </w:r>
-    </w:p>
-    <w:p>
-      <w:pPr>
-        <w:spacing w:before="240" w:after="120" w:line="480" w:lineRule="auto"/>
-        <w:rPr>
-          <w:rFonts w:ascii="Times New Roman" w:eastAsia="Arial" w:hAnsi="Times New Roman" w:cs="Times New Roman"/>
-          <w:sz w:val="24"/>
-          <w:szCs w:val="24"/>
-          <w:highlight w:val="yellow"/>
-        </w:rPr>
-      </w:pPr>
-      <w:r>
-        <w:rPr>
-          <w:rFonts w:ascii="Times New Roman" w:eastAsia="Arial" w:hAnsi="Times New Roman" w:cs="Times New Roman"/>
-          <w:b/>
-          <w:bCs/>
-          <w:sz w:val="24"/>
-          <w:szCs w:val="24"/>
-          <w:highlight w:val="white"/>
-        </w:rPr>
-        <w:t>SEMESTRE MATRICULADO EM 202</w:t>
-      </w:r>
-      <w:r>
-        <w:rPr>
-          <w:rFonts w:ascii="Times New Roman" w:eastAsia="Arial" w:hAnsi="Times New Roman" w:cs="Times New Roman"/>
-          <w:b/>
-          <w:bCs/>
-          <w:sz w:val="24"/>
-          <w:szCs w:val="24"/>
-          <w:highlight w:val="white"/>
-        </w:rPr>
-        <w:t>6</w:t>
-      </w:r>
-      <w:r>
-        <w:rPr>
-          <w:rFonts w:ascii="Times New Roman" w:eastAsia="Arial" w:hAnsi="Times New Roman" w:cs="Times New Roman"/>
-          <w:b/>
-          <w:bCs/>
-          <w:sz w:val="24"/>
-          <w:szCs w:val="24"/>
-          <w:highlight w:val="white"/>
-        </w:rPr>
-        <w:t>.</w:t>
-      </w:r>
-      <w:r>
-        <w:rPr>
-          <w:rFonts w:ascii="Times New Roman" w:eastAsia="Arial" w:hAnsi="Times New Roman" w:cs="Times New Roman"/>
-          <w:b/>
-          <w:bCs/>
-          <w:sz w:val="24"/>
-          <w:szCs w:val="24"/>
-          <w:highlight w:val="white"/>
-        </w:rPr>
-        <w:t>1</w:t>
-      </w:r>
-      <w:r>
-        <w:rPr>
-          <w:rFonts w:ascii="Times New Roman" w:eastAsia="Arial" w:hAnsi="Times New Roman" w:cs="Times New Roman"/>
-          <w:b/>
-          <w:bCs/>
-          <w:sz w:val="24"/>
-          <w:szCs w:val="24"/>
-          <w:highlight w:val="white"/>
-        </w:rPr>
-        <w:t>:</w:t>
-      </w:r>
-      <w:r>
-        <w:rPr>
-          <w:rFonts w:ascii="Times New Roman" w:eastAsia="Arial" w:hAnsi="Times New Roman" w:cs="Times New Roman"/>
-          <w:b/>
-          <w:bCs/>
-          <w:sz w:val="24"/>
-          <w:szCs w:val="24"/>
-          <w:highlight w:val="white"/>
-        </w:rPr>
-        <w:t xml:space="preserve"> </w:t>
+        <w:t xml:space="preserve">SEMESTRE MATRICULADO EM 2026.1: </w:t>
       </w:r>
       <w:r>
         <w:rPr>
@@ -1886,46 +1645,29 @@
           <w:szCs w:val="24"/>
           <w:highlight w:val="white"/>
         </w:rPr>
-        <w:t xml:space="preserve"> </w:t>
-      </w:r>
-      <w:r>
-        <w:rPr>
-          <w:rFonts w:ascii="Times New Roman" w:eastAsia="Arial" w:hAnsi="Times New Roman" w:cs="Times New Roman"/>
+        <w:t xml:space="preserve"> {{APOLICE}}</w:t>
+      </w:r>
+    </w:p>
+    <w:p>
+      <w:pPr>
+        <w:spacing w:before="240" w:after="120" w:line="480" w:lineRule="auto"/>
+        <w:rPr>
+          <w:rFonts w:ascii="Times New Roman" w:eastAsia="Arial" w:hAnsi="Times New Roman" w:cs="Times New Roman"/>
+          <w:sz w:val="24"/>
+          <w:szCs w:val="24"/>
+          <w:highlight w:val="yellow"/>
+        </w:rPr>
+      </w:pPr>
+      <w:r>
+        <w:rPr>
+          <w:rFonts w:ascii="Times New Roman" w:eastAsia="Arial" w:hAnsi="Times New Roman" w:cs="Times New Roman"/>
+          <w:b/>
+          <w:bCs/>
           <w:sz w:val="24"/>
           <w:szCs w:val="24"/>
           <w:highlight w:val="white"/>
         </w:rPr>
-        <w:t>{{APOLICE}}</w:t>
-      </w:r>
-    </w:p>
-    <w:p>
-      <w:pPr>
-        <w:spacing w:before="240" w:after="120" w:line="480" w:lineRule="auto"/>
-        <w:rPr>
-          <w:rFonts w:ascii="Times New Roman" w:eastAsia="Arial" w:hAnsi="Times New Roman" w:cs="Times New Roman"/>
-          <w:sz w:val="24"/>
-          <w:szCs w:val="24"/>
-          <w:highlight w:val="yellow"/>
-        </w:rPr>
-      </w:pPr>
-      <w:r>
-        <w:rPr>
-          <w:rFonts w:ascii="Times New Roman" w:eastAsia="Arial" w:hAnsi="Times New Roman" w:cs="Times New Roman"/>
-          <w:b/>
-          <w:bCs/>
-          <w:sz w:val="24"/>
-          <w:szCs w:val="24"/>
-          <w:highlight w:val="white"/>
-        </w:rPr>
         <w:t>EMPRESA SEGURADORA: {{SEGURADORA}}</w:t>
-      </w:r>
-      <w:r>
-        <w:rPr>
-          <w:rFonts w:ascii="Times New Roman" w:eastAsia="Arial" w:hAnsi="Times New Roman" w:cs="Times New Roman"/>
-          <w:sz w:val="24"/>
-          <w:szCs w:val="24"/>
-          <w:highlight w:val="white"/>
-        </w:rPr>
       </w:r>
     </w:p>
     <w:p>
@@ -2106,23 +1848,23 @@
           <w:sz w:val="24"/>
           <w:szCs w:val="24"/>
         </w:rPr>
-        <w:t xml:space="preserve">São Paulo, </w:t>
-      </w:r>
-      <w:r>
-        <w:rPr>
-          <w:rFonts w:ascii="Times New Roman" w:eastAsia="Arial" w:hAnsi="Times New Roman" w:cs="Times New Roman"/>
-          <w:sz w:val="24"/>
-          <w:szCs w:val="24"/>
-        </w:rPr>
-        <w:t>{{DATA_FIM_VIGENCIA}}</w:t>
-      </w:r>
-      <w:r>
-        <w:rPr>
-          <w:rFonts w:ascii="Times New Roman" w:eastAsia="Arial" w:hAnsi="Times New Roman" w:cs="Times New Roman"/>
-          <w:sz w:val="24"/>
-          <w:szCs w:val="24"/>
-        </w:rPr>
-        <w:t>.</w:t>
+        <w:t>São Paulo, {{DATA_FIM_</w:t>
+      </w:r>
+      <w:r>
+        <w:rPr>
+          <w:rFonts w:ascii="Times New Roman" w:eastAsia="Arial" w:hAnsi="Times New Roman" w:cs="Times New Roman"/>
+          <w:sz w:val="24"/>
+          <w:szCs w:val="24"/>
+        </w:rPr>
+        <w:t>EXTENSO</w:t>
+      </w:r>
+      <w:r>
+        <w:rPr>
+          <w:rFonts w:ascii="Times New Roman" w:eastAsia="Arial" w:hAnsi="Times New Roman" w:cs="Times New Roman"/>
+          <w:sz w:val="24"/>
+          <w:szCs w:val="24"/>
+        </w:rPr>
+        <w:t>}}.</w:t>
       </w:r>
     </w:p>
     <w:p>
@@ -2203,31 +1945,7 @@
           <w:sz w:val="24"/>
           <w:szCs w:val="24"/>
         </w:rPr>
-        <w:t xml:space="preserve"> </w:t>
-      </w:r>
-      <w:r>
-        <w:rPr>
-          <w:rFonts w:ascii="Times New Roman" w:eastAsia="Arial" w:hAnsi="Times New Roman" w:cs="Times New Roman"/>
-          <w:sz w:val="24"/>
-          <w:szCs w:val="24"/>
-        </w:rPr>
-        <w:t>{{</w:t>
-      </w:r>
-      <w:r>
-        <w:rPr>
-          <w:rFonts w:ascii="Times New Roman" w:eastAsia="Arial" w:hAnsi="Times New Roman" w:cs="Times New Roman"/>
-          <w:sz w:val="24"/>
-          <w:szCs w:val="24"/>
-        </w:rPr>
-        <w:t>EMPRESA_FANTASIA</w:t>
-      </w:r>
-      <w:r>
-        <w:rPr>
-          <w:rFonts w:ascii="Times New Roman" w:eastAsia="Arial" w:hAnsi="Times New Roman" w:cs="Times New Roman"/>
-          <w:sz w:val="24"/>
-          <w:szCs w:val="24"/>
-        </w:rPr>
-        <w:t>}}</w:t>
+        <w:t xml:space="preserve"> {{EMPRESA_FANTASIA}}</w:t>
       </w:r>
     </w:p>
     <w:p>
@@ -2257,15 +1975,7 @@
           <w:sz w:val="24"/>
           <w:szCs w:val="24"/>
         </w:rPr>
-        <w:t xml:space="preserve"> </w:t>
-      </w:r>
-      <w:r>
-        <w:rPr>
-          <w:rFonts w:ascii="Times New Roman" w:eastAsia="Arial" w:hAnsi="Times New Roman" w:cs="Times New Roman"/>
-          <w:sz w:val="24"/>
-          <w:szCs w:val="24"/>
-        </w:rPr>
-        <w:t>{{EMPRESA}}</w:t>
+        <w:t xml:space="preserve"> {{EMPRESA}}</w:t>
       </w:r>
     </w:p>
     <w:p>
@@ -2318,60 +2028,38 @@
           <w:szCs w:val="24"/>
           <w:highlight w:val="white"/>
         </w:rPr>
-        <w:t>ENDEREÇO:</w:t>
-      </w:r>
-      <w:r>
-        <w:rPr>
-          <w:rFonts w:ascii="Times New Roman" w:eastAsia="Arial" w:hAnsi="Times New Roman" w:cs="Times New Roman"/>
-          <w:b/>
-          <w:bCs/>
+        <w:t xml:space="preserve">ENDEREÇO: </w:t>
+      </w:r>
+      <w:r>
+        <w:rPr>
+          <w:rFonts w:ascii="Times New Roman" w:eastAsia="Arial" w:hAnsi="Times New Roman" w:cs="Times New Roman"/>
           <w:sz w:val="24"/>
           <w:szCs w:val="24"/>
           <w:highlight w:val="white"/>
         </w:rPr>
-        <w:t xml:space="preserve"> </w:t>
-      </w:r>
-      <w:r>
-        <w:rPr>
-          <w:rFonts w:ascii="Times New Roman" w:eastAsia="Arial" w:hAnsi="Times New Roman" w:cs="Times New Roman"/>
+        <w:t>{{ENDERECO_EMPRESA}}</w:t>
+      </w:r>
+    </w:p>
+    <w:p>
+      <w:pPr>
+        <w:spacing w:after="200" w:line="480" w:lineRule="auto"/>
+        <w:rPr>
+          <w:rFonts w:ascii="Times New Roman" w:eastAsia="Arial" w:hAnsi="Times New Roman" w:cs="Times New Roman"/>
+          <w:sz w:val="24"/>
+          <w:szCs w:val="24"/>
+          <w:highlight w:val="yellow"/>
+        </w:rPr>
+      </w:pPr>
+      <w:r>
+        <w:rPr>
+          <w:rFonts w:ascii="Times New Roman" w:eastAsia="Arial" w:hAnsi="Times New Roman" w:cs="Times New Roman"/>
+          <w:b/>
+          <w:bCs/>
           <w:sz w:val="24"/>
           <w:szCs w:val="24"/>
           <w:highlight w:val="white"/>
         </w:rPr>
-        <w:t>{{ENDERECO_EMPRESA}}</w:t>
-      </w:r>
-    </w:p>
-    <w:p>
-      <w:pPr>
-        <w:spacing w:after="200" w:line="480" w:lineRule="auto"/>
-        <w:rPr>
-          <w:rFonts w:ascii="Times New Roman" w:eastAsia="Arial" w:hAnsi="Times New Roman" w:cs="Times New Roman"/>
-          <w:sz w:val="24"/>
-          <w:szCs w:val="24"/>
-          <w:highlight w:val="yellow"/>
-        </w:rPr>
-      </w:pPr>
-      <w:r>
-        <w:rPr>
-          <w:rFonts w:ascii="Times New Roman" w:eastAsia="Arial" w:hAnsi="Times New Roman" w:cs="Times New Roman"/>
-          <w:b/>
-          <w:bCs/>
-          <w:sz w:val="24"/>
-          <w:szCs w:val="24"/>
-          <w:highlight w:val="white"/>
-        </w:rPr>
-        <w:t>BAIRRO:</w:t>
-      </w:r>
-      <w:r>
-        <w:rPr>
-          <w:rFonts w:ascii="Times New Roman" w:eastAsia="Arial" w:hAnsi="Times New Roman" w:cs="Times New Roman"/>
-          <w:b/>
-          <w:bCs/>
-          <w:sz w:val="24"/>
-          <w:szCs w:val="24"/>
-          <w:highlight w:val="white"/>
-        </w:rPr>
-        <w:t xml:space="preserve"> </w:t>
+        <w:t xml:space="preserve">BAIRRO: </w:t>
       </w:r>
       <w:r>
         <w:rPr>
@@ -2560,36 +2248,16 @@
           <w:szCs w:val="24"/>
           <w:highlight w:val="white"/>
         </w:rPr>
-        <w:t>Nº DE INSCRIÇÃO NO CONSELHO:</w:t>
-      </w:r>
-      <w:r>
-        <w:rPr>
-          <w:rFonts w:ascii="Times New Roman" w:eastAsia="Arial" w:hAnsi="Times New Roman" w:cs="Times New Roman"/>
-          <w:b/>
-          <w:bCs/>
+        <w:t xml:space="preserve">Nº DE INSCRIÇÃO NO CONSELHO: </w:t>
+      </w:r>
+      <w:r>
+        <w:rPr>
+          <w:rFonts w:ascii="Times New Roman" w:eastAsia="Arial" w:hAnsi="Times New Roman" w:cs="Times New Roman"/>
           <w:sz w:val="24"/>
           <w:szCs w:val="24"/>
           <w:highlight w:val="white"/>
         </w:rPr>
-        <w:t xml:space="preserve"> </w:t>
-      </w:r>
-      <w:r>
-        <w:rPr>
-          <w:rFonts w:ascii="Times New Roman" w:eastAsia="Arial" w:hAnsi="Times New Roman" w:cs="Times New Roman"/>
-          <w:sz w:val="24"/>
-          <w:szCs w:val="24"/>
-          <w:highlight w:val="white"/>
-        </w:rPr>
-        <w:t>{{</w:t>
-      </w:r>
-      <w:r>
-        <w:rPr>
-          <w:rFonts w:ascii="Times New Roman" w:eastAsia="Arial" w:hAnsi="Times New Roman" w:cs="Times New Roman"/>
-          <w:sz w:val="24"/>
-          <w:szCs w:val="24"/>
-          <w:highlight w:val="white"/>
-        </w:rPr>
-        <w:t>CONSELHO_RT}}</w:t>
+        <w:t>{{CONSELHO_RT}}</w:t>
       </w:r>
     </w:p>
     <w:p>
@@ -2746,21 +2414,7 @@
           <w:rFonts w:ascii="Times New Roman" w:eastAsia="Arial" w:hAnsi="Times New Roman" w:cs="Times New Roman"/>
           <w:highlight w:val="white"/>
         </w:rPr>
-        <w:t>{{</w:t>
-      </w:r>
-      <w:r>
-        <w:rPr>
-          <w:rFonts w:ascii="Times New Roman" w:eastAsia="Arial" w:hAnsi="Times New Roman" w:cs="Times New Roman"/>
-          <w:highlight w:val="white"/>
-        </w:rPr>
-        <w:t>CONSELHO_RT</w:t>
-      </w:r>
-      <w:r>
-        <w:rPr>
-          <w:rFonts w:ascii="Times New Roman" w:eastAsia="Arial" w:hAnsi="Times New Roman" w:cs="Times New Roman"/>
-          <w:highlight w:val="white"/>
-        </w:rPr>
-        <w:t>}}</w:t>
+        <w:t>{{CONSELHO_RT}}</w:t>
       </w:r>
     </w:p>
     <w:p>
@@ -4360,10 +4014,7 @@
       </w:pPr>
       <w:r>
         <w:lastRenderedPageBreak/>
-        <w:t xml:space="preserve">1. </w:t>
-      </w:r>
-      <w:r>
-        <w:t>INTRODUÇÃO</w:t>
+        <w:t>1. INTRODUÇÃO</w:t>
       </w:r>
     </w:p>
     <w:p>
@@ -4381,23 +4032,7 @@
           <w:sz w:val="24"/>
           <w:szCs w:val="24"/>
         </w:rPr>
-        <w:t>{{INTRODU</w:t>
-      </w:r>
-      <w:r>
-        <w:rPr>
-          <w:rFonts w:ascii="Times New Roman" w:eastAsia="Arial" w:hAnsi="Times New Roman" w:cs="Times New Roman"/>
-          <w:sz w:val="24"/>
-          <w:szCs w:val="24"/>
-        </w:rPr>
-        <w:t>CAO</w:t>
-      </w:r>
-      <w:r>
-        <w:rPr>
-          <w:rFonts w:ascii="Times New Roman" w:eastAsia="Arial" w:hAnsi="Times New Roman" w:cs="Times New Roman"/>
-          <w:sz w:val="24"/>
-          <w:szCs w:val="24"/>
-        </w:rPr>
-        <w:t>}}</w:t>
+        <w:t>{{INTRODUCAO}}</w:t>
       </w:r>
     </w:p>
     <w:p>
@@ -4405,16 +4040,7 @@
         <w:pStyle w:val="Ttulo1"/>
       </w:pPr>
       <w:r>
-        <w:t xml:space="preserve">2. </w:t>
-      </w:r>
-      <w:r>
-        <w:t>OBJETIVO</w:t>
-      </w:r>
-      <w:r>
-        <w:t>S</w:t>
-      </w:r>
-      <w:r>
-        <w:t xml:space="preserve"> DO ESTÁGIO</w:t>
+        <w:t>2. OBJETIVOS DO ESTÁGIO</w:t>
       </w:r>
     </w:p>
     <w:p>
@@ -4471,10 +4097,7 @@
         <w:pStyle w:val="Ttulo1"/>
       </w:pPr>
       <w:r>
-        <w:t xml:space="preserve">3. </w:t>
-      </w:r>
-      <w:r>
-        <w:t>SOBRE O CAMPO CEDENTE</w:t>
+        <w:t>3. SOBRE O CAMPO CEDENTE</w:t>
       </w:r>
     </w:p>
     <w:p>
@@ -4482,13 +4105,7 @@
         <w:pStyle w:val="Ttulo2"/>
       </w:pPr>
       <w:r>
-        <w:t xml:space="preserve">3.1 História da </w:t>
-      </w:r>
-      <w:r>
-        <w:t>e</w:t>
-      </w:r>
-      <w:r>
-        <w:t>mpresa</w:t>
+        <w:t>3.1 História da empresa</w:t>
       </w:r>
     </w:p>
     <w:p>
@@ -4563,16 +4180,7 @@
         <w:pStyle w:val="Ttulo2"/>
       </w:pPr>
       <w:r>
-        <w:t xml:space="preserve">4.1 Atividade 1 </w:t>
-      </w:r>
-      <w:r>
-        <w:t>–</w:t>
-      </w:r>
-      <w:r>
-        <w:t xml:space="preserve"> </w:t>
-      </w:r>
-      <w:r>
-        <w:t>{{TITULO_ATV1}}</w:t>
+        <w:t>4.1 Atividade 1 – {{TITULO_ATV1}}</w:t>
       </w:r>
     </w:p>
     <w:p>
@@ -4613,16 +4221,7 @@
         <w:pStyle w:val="Ttulo2"/>
       </w:pPr>
       <w:r>
-        <w:t xml:space="preserve">4.2 Atividade 2 </w:t>
-      </w:r>
-      <w:r>
-        <w:t>–</w:t>
-      </w:r>
-      <w:r>
-        <w:t xml:space="preserve"> </w:t>
-      </w:r>
-      <w:r>
-        <w:t>{{TITULO_ATV2}}</w:t>
+        <w:t>4.2 Atividade 2 – {{TITULO_ATV2}}</w:t>
       </w:r>
     </w:p>
     <w:p>
@@ -4650,16 +4249,7 @@
         <w:pStyle w:val="Ttulo2"/>
       </w:pPr>
       <w:r>
-        <w:t xml:space="preserve">4.3 Atividade 3 </w:t>
-      </w:r>
-      <w:r>
-        <w:t>–</w:t>
-      </w:r>
-      <w:r>
-        <w:t xml:space="preserve"> </w:t>
-      </w:r>
-      <w:r>
-        <w:t>{{TITULO_ATV3}}</w:t>
+        <w:t>4.3 Atividade 3 – {{TITULO_ATV3}}</w:t>
       </w:r>
     </w:p>
     <w:p>
@@ -4796,7 +4386,6 @@
     <w:p>
       <w:pPr>
         <w:pStyle w:val="Ttulo1"/>
-        <w:keepNext/>
         <w:pageBreakBefore/>
       </w:pPr>
       <w:r>
@@ -4806,8 +4395,6 @@
     </w:p>
     <w:p>
       <w:pPr>
-        <w:ind w:left="0" w:firstLine="0"/>
-        <w:jc w:val="left"/>
         <w:rPr>
           <w:rFonts w:ascii="Times New Roman" w:eastAsia="Arial" w:hAnsi="Times New Roman" w:cs="Times New Roman"/>
           <w:b/>
@@ -4864,10 +4451,7 @@
         <w:pStyle w:val="Ttulo2"/>
       </w:pPr>
       <w:r>
-        <w:t>A</w:t>
-      </w:r>
-      <w:r>
-        <w:t>. Quadro de avaliação do estagiário (assinale com ‘x’)</w:t>
+        <w:t>A. Quadro de avaliação do estagiário (assinale com ‘x’)</w:t>
       </w:r>
     </w:p>
     <w:tbl>
@@ -7196,103 +6780,7 @@
           <w:sz w:val="24"/>
           <w:szCs w:val="24"/>
         </w:rPr>
-        <w:t>Eu,</w:t>
-      </w:r>
-      <w:r>
-        <w:rPr>
-          <w:rFonts w:ascii="Times New Roman" w:eastAsia="Arial" w:hAnsi="Times New Roman" w:cs="Times New Roman"/>
-          <w:sz w:val="24"/>
-          <w:szCs w:val="24"/>
-        </w:rPr>
-        <w:t>{{NOME_RT}}</w:t>
-      </w:r>
-      <w:r>
-        <w:rPr>
-          <w:rFonts w:ascii="Times New Roman" w:eastAsia="Arial" w:hAnsi="Times New Roman" w:cs="Times New Roman"/>
-          <w:sz w:val="24"/>
-          <w:szCs w:val="24"/>
-        </w:rPr>
-        <w:t xml:space="preserve">, portador do Registro Profissional (CRF, CRBM e etc) nº </w:t>
-      </w:r>
-      <w:r>
-        <w:rPr>
-          <w:rFonts w:ascii="Times New Roman" w:eastAsia="Arial" w:hAnsi="Times New Roman" w:cs="Times New Roman"/>
-          <w:sz w:val="24"/>
-          <w:szCs w:val="24"/>
-        </w:rPr>
-        <w:t>{{</w:t>
-      </w:r>
-      <w:r>
-        <w:rPr>
-          <w:rFonts w:ascii="Times New Roman" w:eastAsia="Arial" w:hAnsi="Times New Roman" w:cs="Times New Roman"/>
-          <w:sz w:val="24"/>
-          <w:szCs w:val="24"/>
-        </w:rPr>
-        <w:t>CONSELHO_RT</w:t>
-      </w:r>
-      <w:r>
-        <w:rPr>
-          <w:rFonts w:ascii="Times New Roman" w:eastAsia="Arial" w:hAnsi="Times New Roman" w:cs="Times New Roman"/>
-          <w:sz w:val="24"/>
-          <w:szCs w:val="24"/>
-        </w:rPr>
-        <w:t>}}</w:t>
-      </w:r>
-      <w:r>
-        <w:rPr>
-          <w:rFonts w:ascii="Times New Roman" w:eastAsia="Arial" w:hAnsi="Times New Roman" w:cs="Times New Roman"/>
-          <w:sz w:val="24"/>
-          <w:szCs w:val="24"/>
-        </w:rPr>
-        <w:t xml:space="preserve"> declaro que o acadêmico</w:t>
-      </w:r>
-      <w:r>
-        <w:rPr>
-          <w:rFonts w:ascii="Times New Roman" w:eastAsia="Arial" w:hAnsi="Times New Roman" w:cs="Times New Roman"/>
-          <w:sz w:val="24"/>
-          <w:szCs w:val="24"/>
-        </w:rPr>
-        <w:t xml:space="preserve"> {{NOME_ALUNO}},</w:t>
-      </w:r>
-      <w:r>
-        <w:rPr>
-          <w:rFonts w:ascii="Times New Roman" w:eastAsia="Arial" w:hAnsi="Times New Roman" w:cs="Times New Roman"/>
-          <w:sz w:val="24"/>
-          <w:szCs w:val="24"/>
-        </w:rPr>
-        <w:t xml:space="preserve"> RA nº</w:t>
-      </w:r>
-      <w:r>
-        <w:rPr>
-          <w:rFonts w:ascii="Times New Roman" w:eastAsia="Arial" w:hAnsi="Times New Roman" w:cs="Times New Roman"/>
-          <w:sz w:val="24"/>
-          <w:szCs w:val="24"/>
-        </w:rPr>
-        <w:t xml:space="preserve"> {{RA_ALUNO}}</w:t>
-      </w:r>
-      <w:r>
-        <w:rPr>
-          <w:rFonts w:ascii="Times New Roman" w:eastAsia="Arial" w:hAnsi="Times New Roman" w:cs="Times New Roman"/>
-          <w:sz w:val="24"/>
-          <w:szCs w:val="24"/>
-        </w:rPr>
-        <w:t xml:space="preserve">, cumpriu carga horária de </w:t>
-      </w:r>
-      <w:r>
-        <w:rPr>
-          <w:rFonts w:ascii="Times New Roman" w:eastAsia="Arial" w:hAnsi="Times New Roman" w:cs="Times New Roman"/>
-          <w:sz w:val="24"/>
-          <w:szCs w:val="24"/>
-        </w:rPr>
-        <w:t>{{CARGA_HORARIA}}</w:t>
-      </w:r>
-      <w:r>
-        <w:rPr>
-          <w:rFonts w:ascii="Times New Roman" w:eastAsia="Arial" w:hAnsi="Times New Roman" w:cs="Times New Roman"/>
-          <w:sz w:val="24"/>
-          <w:szCs w:val="24"/>
-        </w:rPr>
-        <w:t xml:space="preserve"> de estágio nesta Instituição.  </w:t>
+        <w:t xml:space="preserve">Eu,{{NOME_RT}}, portador do Registro Profissional (CRF, CRBM e etc) nº {{CONSELHO_RT}} declaro que o acadêmico {{NOME_ALUNO}}, RA nº {{RA_ALUNO}}, cumpriu carga horária de {{CARGA_HORARIA}} de estágio nesta Instituição.  </w:t>
       </w:r>
     </w:p>
     <w:p>
@@ -7313,23 +6801,7 @@
           <w:sz w:val="20"/>
           <w:szCs w:val="20"/>
         </w:rPr>
-        <w:t xml:space="preserve">São Paulo, </w:t>
-      </w:r>
-      <w:r>
-        <w:rPr>
-          <w:rFonts w:ascii="Times New Roman" w:eastAsia="Arial" w:hAnsi="Times New Roman" w:cs="Times New Roman"/>
-          <w:sz w:val="20"/>
-          <w:szCs w:val="20"/>
-        </w:rPr>
-        <w:t>{{DATA_FIM_EXTENSO}}</w:t>
-      </w:r>
-      <w:r>
-        <w:rPr>
-          <w:rFonts w:ascii="Times New Roman" w:eastAsia="Arial" w:hAnsi="Times New Roman" w:cs="Times New Roman"/>
-          <w:sz w:val="20"/>
-          <w:szCs w:val="20"/>
-        </w:rPr>
-        <w:t>.</w:t>
+        <w:t>São Paulo, {{DATA_FIM_EXTENSO}}.</w:t>
       </w:r>
     </w:p>
     <w:p>
@@ -7390,13 +6862,7 @@
       </w:pPr>
       <w:r>
         <w:lastRenderedPageBreak/>
-        <w:t>B</w:t>
-      </w:r>
-      <w:r>
-        <w:t xml:space="preserve">. </w:t>
-      </w:r>
-      <w:r>
-        <w:t>Controle de frequência</w:t>
+        <w:t>B. Controle de frequência</w:t>
       </w:r>
     </w:p>
     <w:p>
@@ -7431,17 +6897,7 @@
           <w:sz w:val="24"/>
           <w:szCs w:val="24"/>
         </w:rPr>
-        <w:t>Nome do aluno:</w:t>
-      </w:r>
-      <w:r>
-        <w:rPr>
-          <w:rFonts w:ascii="Times New Roman" w:eastAsia="Arial" w:hAnsi="Times New Roman" w:cs="Times New Roman"/>
-          <w:b/>
-          <w:bCs/>
-          <w:sz w:val="24"/>
-          <w:szCs w:val="24"/>
-        </w:rPr>
-        <w:t xml:space="preserve"> </w:t>
+        <w:t xml:space="preserve">Nome do aluno: </w:t>
       </w:r>
       <w:r>
         <w:rPr>
@@ -7468,26 +6924,7 @@
           <w:szCs w:val="24"/>
         </w:rPr>
         <w:tab/>
-      </w:r>
-      <w:r>
-        <w:rPr>
-          <w:rFonts w:ascii="Times New Roman" w:eastAsia="Arial" w:hAnsi="Times New Roman" w:cs="Times New Roman"/>
-          <w:b/>
-          <w:bCs/>
-          <w:sz w:val="24"/>
-          <w:szCs w:val="24"/>
-        </w:rPr>
-        <w:t xml:space="preserve"> RA nº</w:t>
-      </w:r>
-      <w:r>
-        <w:rPr>
-          <w:rFonts w:ascii="Times New Roman" w:eastAsia="Arial" w:hAnsi="Times New Roman" w:cs="Times New Roman"/>
-          <w:b/>
-          <w:bCs/>
-          <w:sz w:val="24"/>
-          <w:szCs w:val="24"/>
-        </w:rPr>
-        <w:t xml:space="preserve"> </w:t>
+        <w:t xml:space="preserve"> RA nº </w:t>
       </w:r>
       <w:r>
         <w:rPr>
@@ -7519,17 +6956,7 @@
           <w:sz w:val="24"/>
           <w:szCs w:val="24"/>
         </w:rPr>
-        <w:t>Instituição cedente do estágio</w:t>
-      </w:r>
-      <w:r>
-        <w:rPr>
-          <w:rFonts w:ascii="Times New Roman" w:eastAsia="Arial" w:hAnsi="Times New Roman" w:cs="Times New Roman"/>
-          <w:b/>
-          <w:bCs/>
-          <w:sz w:val="24"/>
-          <w:szCs w:val="24"/>
-        </w:rPr>
-        <w:t xml:space="preserve">: </w:t>
+        <w:t xml:space="preserve">Instituição cedente do estágio: </w:t>
       </w:r>
       <w:r>
         <w:rPr>
@@ -7561,17 +6988,7 @@
           <w:sz w:val="24"/>
           <w:szCs w:val="24"/>
         </w:rPr>
-        <w:t>Responsável Técnico:</w:t>
-      </w:r>
-      <w:r>
-        <w:rPr>
-          <w:rFonts w:ascii="Times New Roman" w:eastAsia="Arial" w:hAnsi="Times New Roman" w:cs="Times New Roman"/>
-          <w:b/>
-          <w:bCs/>
-          <w:sz w:val="24"/>
-          <w:szCs w:val="24"/>
-        </w:rPr>
-        <w:t xml:space="preserve"> </w:t>
+        <w:t xml:space="preserve">Responsável Técnico: </w:t>
       </w:r>
       <w:r>
         <w:rPr>
@@ -7600,50 +7017,15 @@
           <w:szCs w:val="24"/>
         </w:rPr>
         <w:tab/>
-      </w:r>
-      <w:r>
-        <w:rPr>
-          <w:rFonts w:ascii="Times New Roman" w:eastAsia="Arial" w:hAnsi="Times New Roman" w:cs="Times New Roman"/>
-          <w:b/>
-          <w:bCs/>
-          <w:sz w:val="24"/>
-          <w:szCs w:val="24"/>
-        </w:rPr>
-        <w:t xml:space="preserve">  Conselho nº</w:t>
-      </w:r>
-      <w:r>
-        <w:rPr>
-          <w:rFonts w:ascii="Times New Roman" w:eastAsia="Arial" w:hAnsi="Times New Roman" w:cs="Times New Roman"/>
-          <w:b/>
-          <w:bCs/>
-          <w:sz w:val="24"/>
-          <w:szCs w:val="24"/>
-        </w:rPr>
-        <w:t xml:space="preserve"> </w:t>
-      </w:r>
-      <w:r>
-        <w:rPr>
-          <w:rFonts w:ascii="Times New Roman" w:eastAsia="Arial" w:hAnsi="Times New Roman" w:cs="Times New Roman"/>
-          <w:sz w:val="24"/>
-          <w:szCs w:val="24"/>
-        </w:rPr>
-        <w:t>{{</w:t>
-      </w:r>
-      <w:r>
-        <w:rPr>
-          <w:rFonts w:ascii="Times New Roman" w:eastAsia="Arial" w:hAnsi="Times New Roman" w:cs="Times New Roman"/>
-          <w:sz w:val="24"/>
-          <w:szCs w:val="24"/>
-        </w:rPr>
-        <w:t>CONSELHO_RT</w:t>
-      </w:r>
-      <w:r>
-        <w:rPr>
-          <w:rFonts w:ascii="Times New Roman" w:eastAsia="Arial" w:hAnsi="Times New Roman" w:cs="Times New Roman"/>
-          <w:sz w:val="24"/>
-          <w:szCs w:val="24"/>
-        </w:rPr>
-        <w:t>}}</w:t>
+        <w:t xml:space="preserve">  Conselho nº </w:t>
+      </w:r>
+      <w:r>
+        <w:rPr>
+          <w:rFonts w:ascii="Times New Roman" w:eastAsia="Arial" w:hAnsi="Times New Roman" w:cs="Times New Roman"/>
+          <w:sz w:val="24"/>
+          <w:szCs w:val="24"/>
+        </w:rPr>
+        <w:t>{{CONSELHO_RT}}</w:t>
       </w:r>
     </w:p>
     <w:tbl>

</xml_diff>